<commit_message>
fix(policies): keep fictional notice to cover and final note, number tables from 1
Remove the per-page banner that polluted text extraction and start table
numbering at 1 in PDF and DOCX, regenerating the sample policies.

Co-Authored-By: Claude Sonnet 5.5 <noreply@anthropic.com>
Claude-Session: https://claude.ai/code/session_01NnwMJ1f3MGJf9cGxryrMgf
</commit_message>
<xml_diff>
--- a/Policy/01_Aurelius_DO_Energia_Capital_Aberto.docx
+++ b/Policy/01_Aurelius_DO_Energia_Capital_Aberto.docx
@@ -195,7 +195,7 @@
               <w:rPr>
                 <w:sz w:val="17"/>
               </w:rPr>
-              <w:t>15414.900118/2019-71 (fictício)</w:t>
+              <w:t>15414.900118/2019-71</w:t>
             </w:r>
           </w:p>
         </w:tc>
@@ -454,7 +454,7 @@
               <w:rPr>
                 <w:sz w:val="17"/>
               </w:rPr>
-              <w:t>Meridiano Corretora de Seguros Ltda. – SUSEP nº 202045118 (fictício)</w:t>
+              <w:t>Meridiano Corretora de Seguros Ltda. – SUSEP nº 202045118</w:t>
             </w:r>
           </w:p>
         </w:tc>
@@ -513,7 +513,7 @@
           <w:b/>
           <w:color w:val="3B4A5A"/>
         </w:rPr>
-        <w:t>Quadro 0 – Limite, moeda e prêmio</w:t>
+        <w:t>Quadro 1 – Limite, moeda e prêmio</w:t>
       </w:r>
     </w:p>
     <w:tbl>
@@ -816,7 +816,7 @@
           <w:b/>
           <w:color w:val="3B4A5A"/>
         </w:rPr>
-        <w:t>Quadro 1 – Limite Máximo de Garantia, coberturas e sublimites</w:t>
+        <w:t>Quadro 2 – Limite Máximo de Garantia, coberturas e sublimites</w:t>
       </w:r>
     </w:p>
     <w:tbl>
@@ -3360,7 +3360,7 @@
           <w:b/>
           <w:color w:val="3B4A5A"/>
         </w:rPr>
-        <w:t>Quadro 2 – Franquias, retenção e participação obrigatória</w:t>
+        <w:t>Quadro 3 – Franquias, retenção e participação obrigatória</w:t>
       </w:r>
     </w:p>
     <w:tbl>
@@ -3589,7 +3589,7 @@
           <w:b/>
           <w:color w:val="3B4A5A"/>
         </w:rPr>
-        <w:t>Quadro 3 – Segurados</w:t>
+        <w:t>Quadro 4 – Segurados</w:t>
       </w:r>
     </w:p>
     <w:tbl>
@@ -3818,7 +3818,7 @@
           <w:b/>
           <w:color w:val="3B4A5A"/>
         </w:rPr>
-        <w:t>Quadro 4 – Subsidiárias cobertas</w:t>
+        <w:t>Quadro 5 – Subsidiárias cobertas</w:t>
       </w:r>
     </w:p>
     <w:tbl>
@@ -4010,7 +4010,7 @@
           <w:b/>
           <w:color w:val="3B4A5A"/>
         </w:rPr>
-        <w:t>Quadro 5 – Retroatividade, prazos, território e notificação</w:t>
+        <w:t>Quadro 6 – Retroatividade, prazos, território e notificação</w:t>
       </w:r>
     </w:p>
     <w:tbl>
@@ -4358,7 +4358,7 @@
         <w:jc w:val="both"/>
       </w:pPr>
       <w:r>
-        <w:t>Condições Gerais do Seguro de Responsabilidade Civil de Administradores e Diretores (D&amp;O), Processo SUSEP nº 15414.900118/2019-71 (fictício).</w:t>
+        <w:t>Condições Gerais do Seguro de Responsabilidade Civil de Administradores e Diretores (D&amp;O), Processo SUSEP nº 15414.900118/2019-71.</w:t>
       </w:r>
     </w:p>
     <w:p>
@@ -4464,7 +4464,7 @@
         <w:t xml:space="preserve">2.3  </w:t>
       </w:r>
       <w:r>
-        <w:t>“Subsidiária”: sociedade em que o Tomador detenha, direta ou indiretamente, mais de 50% (cinquenta por cento) do capital votante, ou o poder de eleger a maioria dos administradores, indicada no Quadro 4 ou incluída por endosso.</w:t>
+        <w:t>“Subsidiária”: sociedade em que o Tomador detenha, direta ou indiretamente, mais de 50% (cinquenta por cento) do capital votante, ou o poder de eleger a maioria dos administradores, indicada no Quadro 5 ou incluída por endosso.</w:t>
       </w:r>
     </w:p>
     <w:p>
@@ -4479,7 +4479,7 @@
         <w:t xml:space="preserve">2.4  </w:t>
       </w:r>
       <w:r>
-        <w:t>“Segurado”: as pessoas físicas indicadas no Quadro 3, presentes, passadas ou futuras, que exerçam ou tenham exercido cargo de administração, em conselho, comitê estatutário ou função de gestão com poderes de representação no Tomador ou em Subsidiária, inclusive, quando previsto, o espólio e os herdeiros.</w:t>
+        <w:t>“Segurado”: as pessoas físicas indicadas no Quadro 4, presentes, passadas ou futuras, que exerçam ou tenham exercido cargo de administração, em conselho, comitê estatutário ou função de gestão com poderes de representação no Tomador ou em Subsidiária, inclusive, quando previsto, o espólio e os herdeiros.</w:t>
       </w:r>
     </w:p>
     <w:p>
@@ -4614,7 +4614,7 @@
         <w:t xml:space="preserve">2.13  </w:t>
       </w:r>
       <w:r>
-        <w:t>“Franquia”: parcela das Perdas que fica a cargo do Tomador ou do Segurado, deduzida de cada Reclamação, conforme o Quadro 2.</w:t>
+        <w:t>“Franquia”: parcela das Perdas que fica a cargo do Tomador ou do Segurado, deduzida de cada Reclamação, conforme o Quadro 3.</w:t>
       </w:r>
     </w:p>
     <w:p>
@@ -4689,7 +4689,7 @@
         <w:t xml:space="preserve">2.18  </w:t>
       </w:r>
       <w:r>
-        <w:t>“Prazo Suplementar”: extensão contratável do período de apresentação de Reclamações após o fim da vigência, nas condições do Quadro 5.</w:t>
+        <w:t>“Prazo Suplementar”: extensão contratável do período de apresentação de Reclamações após o fim da vigência, nas condições do Quadro 6.</w:t>
       </w:r>
     </w:p>
     <w:p>
@@ -4727,7 +4727,7 @@
         <w:t xml:space="preserve">3.2  </w:t>
       </w:r>
       <w:r>
-        <w:t>Cobertura B – Reembolso ao Tomador. A Seguradora reembolsará ao Tomador as Perdas que este, na forma da lei ou de seu estatuto, tenha pago ou adiantado em nome do Segurado em razão de Reclamação coberta (Side B), aplicada a franquia do Quadro 2.</w:t>
+        <w:t>Cobertura B – Reembolso ao Tomador. A Seguradora reembolsará ao Tomador as Perdas que este, na forma da lei ou de seu estatuto, tenha pago ou adiantado em nome do Segurado em razão de Reclamação coberta (Side B), aplicada a franquia do Quadro 3.</w:t>
       </w:r>
     </w:p>
     <w:p>
@@ -4923,7 +4923,7 @@
         <w:t xml:space="preserve">5.1  </w:t>
       </w:r>
       <w:r>
-        <w:t>Sujeitas ao LMG, às Franquias e às exclusões destas Condições Gerais, estão contratadas as extensões abaixo, nos limites do Quadro 1. Sublimites integram o LMG e não são adicionais a ele.</w:t>
+        <w:t>Sujeitas ao LMG, às Franquias e às exclusões destas Condições Gerais, estão contratadas as extensões abaixo, nos limites do Quadro 2. Sublimites integram o LMG e não são adicionais a ele.</w:t>
       </w:r>
     </w:p>
     <w:p>
@@ -5013,7 +5013,7 @@
         <w:t xml:space="preserve">5.7  </w:t>
       </w:r>
       <w:r>
-        <w:t>Responsabilidade Tributária e Previdenciária. Estão cobertas as Reclamações que atribuam ao Segurado responsabilidade pessoal por tributos e contribuições não recolhidos pelo Tomador (arts. 135 do Código Tributário Nacional e 50 do Código Civil), até o LMG, sem sublimite específico. O tributo em si, seus acréscimos e a multa fiscal ficam excluídos, salvo se expressamente indicados no Quadro 1.</w:t>
+        <w:t>Responsabilidade Tributária e Previdenciária. Estão cobertas as Reclamações que atribuam ao Segurado responsabilidade pessoal por tributos e contribuições não recolhidos pelo Tomador (arts. 135 do Código Tributário Nacional e 50 do Código Civil), até o LMG, sem sublimite específico. O tributo em si, seus acréscimos e a multa fiscal ficam excluídos, salvo se expressamente indicados no Quadro 2.</w:t>
       </w:r>
     </w:p>
     <w:p>
@@ -5318,7 +5318,7 @@
         <w:t xml:space="preserve">6.2  </w:t>
       </w:r>
       <w:r>
-        <w:t>Sublimites, quando indicados no Quadro 1, são agregados por vigência, integram o LMG e não se somam a ele. O pagamento de um sublimite erode o LMG.</w:t>
+        <w:t>Sublimites, quando indicados no Quadro 2, são agregados por vigência, integram o LMG e não se somam a ele. O pagamento de um sublimite erode o LMG.</w:t>
       </w:r>
     </w:p>
     <w:p>
@@ -5333,7 +5333,7 @@
         <w:t xml:space="preserve">6.3  </w:t>
       </w:r>
       <w:r>
-        <w:t>A Franquia do Quadro 2 é deduzida de cada Reclamação. Quando mais de uma Franquia for aplicável a um mesmo Sinistro, prevalecerá a maior. Não se aplica Franquia aos Custos de Defesa da Cobertura A.</w:t>
+        <w:t>A Franquia do Quadro 3 é deduzida de cada Reclamação. Quando mais de uma Franquia for aplicável a um mesmo Sinistro, prevalecerá a maior. Não se aplica Franquia aos Custos de Defesa da Cobertura A.</w:t>
       </w:r>
     </w:p>
     <w:p>
@@ -5683,7 +5683,7 @@
         <w:t xml:space="preserve">10.2  </w:t>
       </w:r>
       <w:r>
-        <w:t>Observada a exclusão, as Reclamações por dano ambiental decorrentes de decisão de gestão estão cobertas nos termos da Cláusula 5, dentro do sublimite indicado no Quadro 1.</w:t>
+        <w:t>Observada a exclusão, as Reclamações por dano ambiental decorrentes de decisão de gestão estão cobertas nos termos da Cláusula 5, dentro do sublimite indicado no Quadro 2.</w:t>
       </w:r>
     </w:p>
     <w:p>
@@ -6261,6 +6261,15 @@
       </w:pPr>
       <w:r>
         <w:t>Local e data: São Paulo, 29/09/2026. Aurelius Seguros S.A. – Diretoria Técnica. Corretor: Meridiano Corretora de Seguros Ltda..</w:t>
+      </w:r>
+    </w:p>
+    <w:p>
+      <w:r>
+        <w:rPr>
+          <w:color w:val="3B4A5A"/>
+          <w:sz w:val="16"/>
+        </w:rPr>
+        <w:t>Nota final: esta apólice é fictícia e não tem valor contratual; foi criada apenas para testes do ClauseAI.</w:t>
       </w:r>
     </w:p>
     <w:sectPr>
@@ -6286,7 +6295,7 @@
       <w:rPr>
         <w:sz w:val="16"/>
       </w:rPr>
-      <w:t xml:space="preserve">Aurelius Seguros S.A. · Apólice nº AUR-0351-2026-000118 · Documento fictício · Página </w:t>
+      <w:t xml:space="preserve">Aurelius Seguros S.A. · Apólice nº AUR-0351-2026-000118 · Página </w:t>
     </w:r>
     <w:r>
       <w:rPr>

</xml_diff>